<commit_message>
Populate doc1 data, refine doc handling & form autofill
Add support for loading doc1 JSON into the admin form when opening type==5 requests and expose it as doc1Data in the model. Tighten PositionDocument queries to exclude drafts and order by copyNumber ASC, id DESC. Update PositionRequestService to treat submitted documents as immutable: if a submitted doc exists create a new draft copy (copyNumber=0) instead of reverting the submitted record, and always mark drafts as isDraft=true when saving. Adjust admin templates: use dean.fullName for select options, remove redundant month/year inputs from doc_form_5, and add client-side JS to auto-fill form fields from existingData, doc1Data and applicant info (with academic-rank logic). Also include updated/added docx template and uploaded document binaries.
</commit_message>
<xml_diff>
--- a/HRCP-KKU-Academic/src/main/resources/templates/docx/Phase2/p2doc_5.docx
+++ b/HRCP-KKU-Academic/src/main/resources/templates/docx/Phase2/p2doc_5.docx
@@ -779,31 +779,12 @@
         <w:spacing w:after="0" w:line="240" w:lineRule="auto"/>
         <w:jc w:val="center"/>
         <w:rPr>
-          <w:rFonts w:ascii="TH Sarabun New" w:hAnsi="TH Sarabun New" w:cs="TH Sarabun New"/>
-          <w:color w:val="000000" w:themeColor="text1"/>
-          <w:sz w:val="32"/>
-          <w:szCs w:val="32"/>
-        </w:rPr>
-      </w:pPr>
-      <w:r>
-        <w:rPr>
-          <w:rFonts w:ascii="TH Sarabun New" w:hAnsi="TH Sarabun New" w:cs="TH Sarabun New"/>
-          <w:color w:val="000000" w:themeColor="text1"/>
-          <w:sz w:val="32"/>
-          <w:szCs w:val="32"/>
-          <w:cs/>
-        </w:rPr>
-        <w:t>วันที่</w:t>
-      </w:r>
-      <w:r>
-        <w:rPr>
-          <w:rFonts w:ascii="Roboto Mono" w:hAnsi="Roboto Mono"/>
-          <w:color w:val="000000" w:themeColor="text1"/>
-          <w:sz w:val="21"/>
-          <w:szCs w:val="21"/>
-        </w:rPr>
-        <w:t xml:space="preserve"> </w:t>
-      </w:r>
+          <w:rFonts w:ascii="TH Sarabun New" w:hAnsi="TH Sarabun New" w:cs="TH Sarabun New" w:hint="cs"/>
+          <w:color w:val="000000" w:themeColor="text1"/>
+          <w:sz w:val="32"/>
+          <w:szCs w:val="32"/>
+        </w:rPr>
+      </w:pPr>
       <w:r>
         <w:rPr>
           <w:rFonts w:ascii="TH Sarabun New" w:hAnsi="TH Sarabun New" w:cs="TH Sarabun New"/>
@@ -812,64 +793,6 @@
           <w:szCs w:val="32"/>
         </w:rPr>
         <w:t>{{dept_date}}</w:t>
-      </w:r>
-      <w:r>
-        <w:rPr>
-          <w:rFonts w:ascii="TH Sarabun New" w:hAnsi="TH Sarabun New" w:cs="TH Sarabun New"/>
-          <w:color w:val="000000" w:themeColor="text1"/>
-          <w:sz w:val="32"/>
-          <w:szCs w:val="32"/>
-          <w:cs/>
-        </w:rPr>
-        <w:t xml:space="preserve"> </w:t>
-      </w:r>
-      <w:r>
-        <w:rPr>
-          <w:rFonts w:ascii="TH Sarabun New" w:hAnsi="TH Sarabun New" w:cs="TH Sarabun New"/>
-          <w:color w:val="000000" w:themeColor="text1"/>
-          <w:sz w:val="32"/>
-          <w:szCs w:val="32"/>
-          <w:cs/>
-        </w:rPr>
-        <w:t>เดือน</w:t>
-      </w:r>
-      <w:r>
-        <w:rPr>
-          <w:rFonts w:ascii="TH Sarabun New" w:hAnsi="TH Sarabun New" w:cs="TH Sarabun New"/>
-          <w:color w:val="000000" w:themeColor="text1"/>
-          <w:sz w:val="32"/>
-          <w:szCs w:val="32"/>
-        </w:rPr>
-        <w:t>{{dept_month}}</w:t>
-      </w:r>
-      <w:r>
-        <w:rPr>
-          <w:rFonts w:ascii="TH Sarabun New" w:hAnsi="TH Sarabun New" w:cs="TH Sarabun New"/>
-          <w:color w:val="000000" w:themeColor="text1"/>
-          <w:sz w:val="32"/>
-          <w:szCs w:val="32"/>
-          <w:cs/>
-        </w:rPr>
-        <w:t xml:space="preserve"> </w:t>
-      </w:r>
-      <w:r>
-        <w:rPr>
-          <w:rFonts w:ascii="TH Sarabun New" w:hAnsi="TH Sarabun New" w:cs="TH Sarabun New"/>
-          <w:color w:val="000000" w:themeColor="text1"/>
-          <w:sz w:val="32"/>
-          <w:szCs w:val="32"/>
-          <w:cs/>
-        </w:rPr>
-        <w:t>พ.ศ.</w:t>
-      </w:r>
-      <w:r>
-        <w:rPr>
-          <w:rFonts w:ascii="TH Sarabun New" w:hAnsi="TH Sarabun New" w:cs="TH Sarabun New"/>
-          <w:color w:val="000000" w:themeColor="text1"/>
-          <w:sz w:val="32"/>
-          <w:szCs w:val="32"/>
-        </w:rPr>
-        <w:t>{{dept_year}}</w:t>
       </w:r>
     </w:p>
     <w:p>
@@ -1189,32 +1112,12 @@
         <w:spacing w:after="0" w:line="240" w:lineRule="auto"/>
         <w:jc w:val="center"/>
         <w:rPr>
-          <w:rFonts w:ascii="TH Sarabun New" w:hAnsi="TH Sarabun New" w:cs="TH Sarabun New"/>
-          <w:color w:val="000000" w:themeColor="text1"/>
-          <w:sz w:val="32"/>
-          <w:szCs w:val="32"/>
-          <w:cs/>
-        </w:rPr>
-      </w:pPr>
-      <w:r>
-        <w:rPr>
-          <w:rFonts w:ascii="TH Sarabun New" w:hAnsi="TH Sarabun New" w:cs="TH Sarabun New"/>
-          <w:color w:val="000000" w:themeColor="text1"/>
-          <w:sz w:val="32"/>
-          <w:szCs w:val="32"/>
-          <w:cs/>
-        </w:rPr>
-        <w:t>วันที่</w:t>
-      </w:r>
-      <w:r>
-        <w:rPr>
-          <w:rFonts w:ascii="Roboto Mono" w:hAnsi="Roboto Mono"/>
-          <w:color w:val="000000" w:themeColor="text1"/>
-          <w:sz w:val="21"/>
-          <w:szCs w:val="21"/>
-        </w:rPr>
-        <w:t xml:space="preserve"> </w:t>
-      </w:r>
+          <w:rFonts w:ascii="TH Sarabun New" w:hAnsi="TH Sarabun New" w:cs="TH Sarabun New" w:hint="cs"/>
+          <w:color w:val="000000" w:themeColor="text1"/>
+          <w:sz w:val="32"/>
+          <w:szCs w:val="32"/>
+        </w:rPr>
+      </w:pPr>
       <w:r>
         <w:rPr>
           <w:rFonts w:ascii="TH Sarabun New" w:hAnsi="TH Sarabun New" w:cs="TH Sarabun New"/>
@@ -1223,73 +1126,6 @@
           <w:szCs w:val="32"/>
         </w:rPr>
         <w:t>{{dean_date}}</w:t>
-      </w:r>
-      <w:r>
-        <w:rPr>
-          <w:rFonts w:ascii="TH Sarabun New" w:hAnsi="TH Sarabun New" w:cs="TH Sarabun New"/>
-          <w:color w:val="000000" w:themeColor="text1"/>
-          <w:sz w:val="32"/>
-          <w:szCs w:val="32"/>
-          <w:cs/>
-        </w:rPr>
-        <w:t xml:space="preserve"> </w:t>
-      </w:r>
-      <w:r>
-        <w:rPr>
-          <w:rFonts w:ascii="TH Sarabun New" w:hAnsi="TH Sarabun New" w:cs="TH Sarabun New"/>
-          <w:color w:val="000000" w:themeColor="text1"/>
-          <w:sz w:val="32"/>
-          <w:szCs w:val="32"/>
-          <w:cs/>
-        </w:rPr>
-        <w:t>เดือน</w:t>
-      </w:r>
-      <w:r>
-        <w:rPr>
-          <w:rFonts w:ascii="Roboto Mono" w:hAnsi="Roboto Mono"/>
-          <w:color w:val="000000" w:themeColor="text1"/>
-          <w:sz w:val="21"/>
-          <w:szCs w:val="21"/>
-        </w:rPr>
-        <w:t xml:space="preserve"> </w:t>
-      </w:r>
-      <w:r>
-        <w:rPr>
-          <w:rFonts w:ascii="TH Sarabun New" w:hAnsi="TH Sarabun New" w:cs="TH Sarabun New"/>
-          <w:color w:val="000000" w:themeColor="text1"/>
-          <w:sz w:val="32"/>
-          <w:szCs w:val="32"/>
-        </w:rPr>
-        <w:t>{{dean_month}}</w:t>
-      </w:r>
-      <w:r>
-        <w:rPr>
-          <w:rFonts w:ascii="TH Sarabun New" w:hAnsi="TH Sarabun New" w:cs="TH Sarabun New"/>
-          <w:color w:val="000000" w:themeColor="text1"/>
-          <w:sz w:val="32"/>
-          <w:szCs w:val="32"/>
-          <w:cs/>
-        </w:rPr>
-        <w:t xml:space="preserve"> </w:t>
-      </w:r>
-      <w:r>
-        <w:rPr>
-          <w:rFonts w:ascii="TH Sarabun New" w:hAnsi="TH Sarabun New" w:cs="TH Sarabun New"/>
-          <w:color w:val="000000" w:themeColor="text1"/>
-          <w:sz w:val="32"/>
-          <w:szCs w:val="32"/>
-          <w:cs/>
-        </w:rPr>
-        <w:t>พ.ศ.</w:t>
-      </w:r>
-      <w:r>
-        <w:rPr>
-          <w:rFonts w:ascii="TH Sarabun New" w:hAnsi="TH Sarabun New" w:cs="TH Sarabun New"/>
-          <w:color w:val="000000" w:themeColor="text1"/>
-          <w:sz w:val="32"/>
-          <w:szCs w:val="32"/>
-        </w:rPr>
-        <w:t>{{dean_year}}</w:t>
       </w:r>
     </w:p>
     <w:sectPr>
@@ -2193,16 +2029,16 @@
     <w:lsdException w:name="Unresolved Mention" w:semiHidden="1" w:unhideWhenUsed="1"/>
     <w:lsdException w:name="Smart Link" w:semiHidden="1" w:unhideWhenUsed="1"/>
   </w:latentStyles>
-  <w:style w:type="paragraph" w:default="1" w:styleId="Normal">
+  <w:style w:type="paragraph" w:default="1" w:styleId="a">
     <w:name w:val="Normal"/>
     <w:qFormat/>
     <w:rsid w:val="00EA52CC"/>
   </w:style>
-  <w:style w:type="paragraph" w:styleId="Heading1">
+  <w:style w:type="paragraph" w:styleId="1">
     <w:name w:val="heading 1"/>
-    <w:basedOn w:val="Normal"/>
-    <w:next w:val="Normal"/>
-    <w:link w:val="Heading1Char"/>
+    <w:basedOn w:val="a"/>
+    <w:next w:val="a"/>
+    <w:link w:val="10"/>
     <w:qFormat/>
     <w:rsid w:val="009A19D5"/>
     <w:pPr>
@@ -2218,13 +2054,13 @@
       <w:szCs w:val="32"/>
     </w:rPr>
   </w:style>
-  <w:style w:type="character" w:default="1" w:styleId="DefaultParagraphFont">
+  <w:style w:type="character" w:default="1" w:styleId="a0">
     <w:name w:val="Default Paragraph Font"/>
     <w:uiPriority w:val="1"/>
     <w:semiHidden/>
     <w:unhideWhenUsed/>
   </w:style>
-  <w:style w:type="table" w:default="1" w:styleId="TableNormal">
+  <w:style w:type="table" w:default="1" w:styleId="a1">
     <w:name w:val="Normal Table"/>
     <w:uiPriority w:val="99"/>
     <w:semiHidden/>
@@ -2239,15 +2075,15 @@
       </w:tblCellMar>
     </w:tblPr>
   </w:style>
-  <w:style w:type="numbering" w:default="1" w:styleId="NoList">
+  <w:style w:type="numbering" w:default="1" w:styleId="a2">
     <w:name w:val="No List"/>
     <w:uiPriority w:val="99"/>
     <w:semiHidden/>
     <w:unhideWhenUsed/>
   </w:style>
-  <w:style w:type="paragraph" w:styleId="ListParagraph">
+  <w:style w:type="paragraph" w:styleId="a3">
     <w:name w:val="List Paragraph"/>
-    <w:basedOn w:val="Normal"/>
+    <w:basedOn w:val="a"/>
     <w:uiPriority w:val="34"/>
     <w:qFormat/>
     <w:rsid w:val="00EA52CC"/>
@@ -2256,10 +2092,10 @@
       <w:contextualSpacing/>
     </w:pPr>
   </w:style>
-  <w:style w:type="paragraph" w:styleId="Header">
+  <w:style w:type="paragraph" w:styleId="a4">
     <w:name w:val="header"/>
-    <w:basedOn w:val="Normal"/>
-    <w:link w:val="HeaderChar"/>
+    <w:basedOn w:val="a"/>
+    <w:link w:val="a5"/>
     <w:uiPriority w:val="99"/>
     <w:unhideWhenUsed/>
     <w:rsid w:val="00EA52CC"/>
@@ -2271,17 +2107,17 @@
       <w:spacing w:after="0" w:line="240" w:lineRule="auto"/>
     </w:pPr>
   </w:style>
-  <w:style w:type="character" w:customStyle="1" w:styleId="HeaderChar">
-    <w:name w:val="Header Char"/>
-    <w:basedOn w:val="DefaultParagraphFont"/>
-    <w:link w:val="Header"/>
+  <w:style w:type="character" w:customStyle="1" w:styleId="a5">
+    <w:name w:val="หัวกระดาษ อักขระ"/>
+    <w:basedOn w:val="a0"/>
+    <w:link w:val="a4"/>
     <w:uiPriority w:val="99"/>
     <w:rsid w:val="00EA52CC"/>
   </w:style>
-  <w:style w:type="paragraph" w:styleId="Footer">
+  <w:style w:type="paragraph" w:styleId="a6">
     <w:name w:val="footer"/>
-    <w:basedOn w:val="Normal"/>
-    <w:link w:val="FooterChar"/>
+    <w:basedOn w:val="a"/>
+    <w:link w:val="a7"/>
     <w:uiPriority w:val="99"/>
     <w:unhideWhenUsed/>
     <w:rsid w:val="00EA52CC"/>
@@ -2293,16 +2129,16 @@
       <w:spacing w:after="0" w:line="240" w:lineRule="auto"/>
     </w:pPr>
   </w:style>
-  <w:style w:type="character" w:customStyle="1" w:styleId="FooterChar">
-    <w:name w:val="Footer Char"/>
-    <w:basedOn w:val="DefaultParagraphFont"/>
-    <w:link w:val="Footer"/>
+  <w:style w:type="character" w:customStyle="1" w:styleId="a7">
+    <w:name w:val="ท้ายกระดาษ อักขระ"/>
+    <w:basedOn w:val="a0"/>
+    <w:link w:val="a6"/>
     <w:uiPriority w:val="99"/>
     <w:rsid w:val="00EA52CC"/>
   </w:style>
-  <w:style w:type="table" w:styleId="TableGrid">
+  <w:style w:type="table" w:styleId="a8">
     <w:name w:val="Table Grid"/>
-    <w:basedOn w:val="TableNormal"/>
+    <w:basedOn w:val="a1"/>
     <w:uiPriority w:val="39"/>
     <w:rsid w:val="00CD3705"/>
     <w:pPr>
@@ -2319,10 +2155,10 @@
       </w:tblBorders>
     </w:tblPr>
   </w:style>
-  <w:style w:type="character" w:customStyle="1" w:styleId="Heading1Char">
-    <w:name w:val="Heading 1 Char"/>
-    <w:basedOn w:val="DefaultParagraphFont"/>
-    <w:link w:val="Heading1"/>
+  <w:style w:type="character" w:customStyle="1" w:styleId="10">
+    <w:name w:val="หัวเรื่อง 1 อักขระ"/>
+    <w:basedOn w:val="a0"/>
+    <w:link w:val="1"/>
     <w:rsid w:val="009A19D5"/>
     <w:rPr>
       <w:rFonts w:ascii="Angsana New" w:eastAsia="Cordia New" w:hAnsi="Angsana New" w:cs="Angsana New"/>

</xml_diff>